<commit_message>
docs: tailored case studies (HKU MA — creative emphasis; HKBU MSc — technical emphasis) + Word copies
</commit_message>
<xml_diff>
--- a/docs/case-study.docx
+++ b/docs/case-study.docx
@@ -21,6 +21,31 @@
     <w:p>
       <w:r>
         <w:t xml:space="preserve">*Draft v1 — numbers marked `[TO FILL]` come from a real take log and must not be invented.*</w:t>
+      </w:r>
+    </w:p>
+    <w:p>
+      <w:r>
+        <w:t xml:space="preserve">Tailored versions of this case study: `case-study-hku.md` (MA — creative emphasis: authorship split</w:t>
+      </w:r>
+    </w:p>
+    <w:p>
+      <w:r>
+        <w:t xml:space="preserve">with the model, reverse locks as aesthetic discipline, one boundary decision) and</w:t>
+      </w:r>
+    </w:p>
+    <w:p>
+      <w:r>
+        <w:t xml:space="preserve">`case-study-hkbu.md` (MSc — technical emphasis: problem framing, data layer, implementation,</w:t>
+      </w:r>
+    </w:p>
+    <w:p>
+      <w:r>
+        <w:t xml:space="preserve">measurement, threats to validity). This file is the neutral master; the two derived versions restructure</w:t>
+      </w:r>
+    </w:p>
+    <w:p>
+      <w:r>
+        <w:t xml:space="preserve">the same facts around different arguments.</w:t>
       </w:r>
     </w:p>
     <w:p>

</xml_diff>